<commit_message>
final commit before midterm submission
</commit_message>
<xml_diff>
--- a/Writeup/Midterm_Heefner, Maxwell.docx
+++ b/Writeup/Midterm_Heefner, Maxwell.docx
@@ -522,7 +522,19 @@
         <w:rPr>
           <w:color w:val="000000" w:themeColor="text1"/>
         </w:rPr>
-        <w:t xml:space="preserve"> codebase was used as the baseline</w:t>
+        <w:t xml:space="preserve"> codebase was used as </w:t>
+      </w:r>
+      <w:r>
+        <w:rPr>
+          <w:color w:val="000000" w:themeColor="text1"/>
+        </w:rPr>
+        <w:t>a</w:t>
+      </w:r>
+      <w:r>
+        <w:rPr>
+          <w:color w:val="000000" w:themeColor="text1"/>
+        </w:rPr>
+        <w:t xml:space="preserve"> baseline</w:t>
       </w:r>
       <w:r>
         <w:rPr>
@@ -875,7 +887,31 @@
         <w:rPr>
           <w:color w:val="000000" w:themeColor="text1"/>
         </w:rPr>
-        <w:t xml:space="preserve">In order to keep track of accuracy, precision, recall and compute F1 Score the True Positive (TP), True Negative (TN), False Positive (FP) and False Negative (FN) responses were recorded. To calculate the </w:t>
+        <w:t>In order to</w:t>
+      </w:r>
+      <w:r>
+        <w:rPr>
+          <w:color w:val="000000" w:themeColor="text1"/>
+        </w:rPr>
+        <w:t xml:space="preserve"> calculate</w:t>
+      </w:r>
+      <w:r>
+        <w:rPr>
+          <w:color w:val="000000" w:themeColor="text1"/>
+        </w:rPr>
+        <w:t xml:space="preserve"> accuracy, precision, recall and F1 Score the True Positive (TP), True Negative (TN), False Positive (FP) and False Negative (FN) responses were recorded</w:t>
+      </w:r>
+      <w:r>
+        <w:rPr>
+          <w:color w:val="000000" w:themeColor="text1"/>
+        </w:rPr>
+        <w:t xml:space="preserve"> through each iteration</w:t>
+      </w:r>
+      <w:r>
+        <w:rPr>
+          <w:color w:val="000000" w:themeColor="text1"/>
+        </w:rPr>
+        <w:t xml:space="preserve">. To calculate the </w:t>
       </w:r>
       <w:r>
         <w:rPr>
@@ -1245,6 +1281,52 @@
         </w:rPr>
       </w:pPr>
     </w:p>
+    <w:p>
+      <w:pPr>
+        <w:autoSpaceDE w:val="0"/>
+        <w:autoSpaceDN w:val="0"/>
+        <w:adjustRightInd w:val="0"/>
+        <w:rPr>
+          <w:color w:val="000000" w:themeColor="text1"/>
+        </w:rPr>
+      </w:pPr>
+      <w:r>
+        <w:rPr>
+          <w:color w:val="000000" w:themeColor="text1"/>
+        </w:rPr>
+        <w:t xml:space="preserve">All code is attached below, along with a README.md that explains how </w:t>
+      </w:r>
+      <w:proofErr w:type="spellStart"/>
+      <w:r>
+        <w:rPr>
+          <w:color w:val="000000" w:themeColor="text1"/>
+        </w:rPr>
+        <w:t>LLaVA</w:t>
+      </w:r>
+      <w:proofErr w:type="spellEnd"/>
+      <w:r>
+        <w:rPr>
+          <w:color w:val="000000" w:themeColor="text1"/>
+        </w:rPr>
+        <w:t xml:space="preserve"> 1.5-7b was evaluated on the MSCOCO Val2014 dataset using POPE random and popular splits, with both regular decoding and VCD.</w:t>
+      </w:r>
+      <w:r>
+        <w:rPr>
+          <w:color w:val="000000" w:themeColor="text1"/>
+        </w:rPr>
+        <w:t xml:space="preserve"> The attached code was used to generate the Table 1 results.</w:t>
+      </w:r>
+    </w:p>
+    <w:p>
+      <w:pPr>
+        <w:autoSpaceDE w:val="0"/>
+        <w:autoSpaceDN w:val="0"/>
+        <w:adjustRightInd w:val="0"/>
+        <w:rPr>
+          <w:color w:val="000000" w:themeColor="text1"/>
+        </w:rPr>
+      </w:pPr>
+    </w:p>
     <w:tbl>
       <w:tblPr>
         <w:tblW w:w="9270" w:type="dxa"/>
@@ -2939,6 +3021,7 @@
         <w:rPr>
           <w:color w:val="000000" w:themeColor="text1"/>
         </w:rPr>
+        <w:lastRenderedPageBreak/>
         <w:t xml:space="preserve">Since </w:t>
       </w:r>
       <w:r>
@@ -3005,15 +3088,15 @@
         <w:autoSpaceDE w:val="0"/>
         <w:autoSpaceDN w:val="0"/>
         <w:adjustRightInd w:val="0"/>
-        <w:rPr>
-          <w:color w:val="000000" w:themeColor="text1"/>
-        </w:rPr>
-      </w:pPr>
-      <w:r>
-        <w:rPr>
-          <w:color w:val="000000" w:themeColor="text1"/>
-        </w:rPr>
-        <w:lastRenderedPageBreak/>
+        <w:ind w:firstLine="720"/>
+        <w:rPr>
+          <w:color w:val="000000" w:themeColor="text1"/>
+        </w:rPr>
+      </w:pPr>
+      <w:r>
+        <w:rPr>
+          <w:color w:val="000000" w:themeColor="text1"/>
+        </w:rPr>
         <w:t>This improvement is limited to adding gaussian noise to each</w:t>
       </w:r>
       <w:r>

</xml_diff>